<commit_message>
fix: rename gRPC to Connect-RPC; fix LaTeX angle-bracket rendering
Spring Street's RPC migration is Goa HTTP to Connect-RPC (Buf Connect over
protobuf), not gRPC. Update resume.tex, experience data, skills, shell
commands, ticker, and SEO metadata to match.

Also fix an OT1 font-encoding issue where `<` and `>` rendered as inverted
Spanish punctuation in the PDF. Switch to T1 fontenc and rebuild resume.pdf
plus regenerate resume.docx via pandoc.
</commit_message>
<xml_diff>
--- a/public/resume.docx
+++ b/public/resume.docx
@@ -203,7 +203,7 @@
         <w:t xml:space="preserve"> </w:t>
       </w:r>
       <w:r>
-        <w:t xml:space="preserve">Goa v3, gRPC (protobuf), Django, DRF, FastAPI, SQLAlchemy, Spring Boot, Node.js, GORM, JWT, RBAC, WebSockets</w:t>
+        <w:t xml:space="preserve">Goa v3, Connect-RPC (protobuf), Django, DRF, FastAPI, SQLAlchemy, Spring Boot, Node.js, GORM, JWT, RBAC, WebSockets</w:t>
       </w:r>
       <w:r>
         <w:br/>
@@ -387,7 +387,7 @@
           <w:bCs/>
           <w:b/>
         </w:rPr>
-        <w:t xml:space="preserve">Goa HTTP to gRPC (protobuf)</w:t>
+        <w:t xml:space="preserve">Goa HTTP to Connect-RPC (protobuf)</w:t>
       </w:r>
       <w:r>
         <w:t xml:space="preserve"> </w:t>
@@ -697,7 +697,7 @@
           <w:bCs/>
           <w:b/>
         </w:rPr>
-        <w:t xml:space="preserve">2–3s -&gt;</w:t>
+        <w:t xml:space="preserve">2–3s</w:t>
       </w:r>
       <w:r>
         <w:rPr>
@@ -711,7 +711,7 @@
           <m:rPr>
             <m:sty m:val="p"/>
           </m:rPr>
-          <m:t>&lt;</m:t>
+          <m:t>→</m:t>
         </m:r>
       </m:oMath>
       <w:r>
@@ -719,7 +719,14 @@
           <w:bCs/>
           <w:b/>
         </w:rPr>
-        <w:t xml:space="preserve">500ms</w:t>
+        <w:t xml:space="preserve"> </w:t>
+      </w:r>
+      <w:r>
+        <w:rPr>
+          <w:bCs/>
+          <w:b/>
+        </w:rPr>
+        <w:t xml:space="preserve">&lt;500ms</w:t>
       </w:r>
       <w:r>
         <w:t xml:space="preserve">.</w:t>
@@ -812,7 +819,7 @@
           <w:bCs/>
           <w:b/>
         </w:rPr>
-        <w:t xml:space="preserve">CLS 0.27 -&gt;</w:t>
+        <w:t xml:space="preserve">CLS 0.27</w:t>
       </w:r>
       <w:r>
         <w:rPr>
@@ -826,7 +833,7 @@
           <m:rPr>
             <m:sty m:val="p"/>
           </m:rPr>
-          <m:t>&lt;</m:t>
+          <m:t>→</m:t>
         </m:r>
       </m:oMath>
       <w:r>
@@ -834,7 +841,14 @@
           <w:bCs/>
           <w:b/>
         </w:rPr>
-        <w:t xml:space="preserve">0.1</w:t>
+        <w:t xml:space="preserve"> </w:t>
+      </w:r>
+      <w:r>
+        <w:rPr>
+          <w:bCs/>
+          <w:b/>
+        </w:rPr>
+        <w:t xml:space="preserve">&lt;0.1</w:t>
       </w:r>
       <w:r>
         <w:t xml:space="preserve">, page weight</w:t>
@@ -1361,14 +1375,7 @@
       </w:r>
     </w:p>
     <w:bookmarkEnd w:id="28"/>
-    <w:sectPr>
-      <w:headerReference r:id="rId9" w:type="default"/>
-      <w:headerReference r:id="rId10" w:type="first"/>
-      <w:footerReference r:id="rId11" w:type="first"/>
-      <w:pgSz w:h="15840" w:orient="portrait" w:w="12240"/>
-      <w:pgMar w:bottom="90" w:footer="720" w:header="720" w:left="720" w:right="450" w:top="270"/>
-      <w:pgNumType w:start="1"/>
-    </w:sectPr>
+    <w:sectPr/>
   </w:body>
 </w:document>
 </file>
@@ -1377,21 +1384,6 @@
 <w:comments xmlns:w="http://schemas.openxmlformats.org/wordprocessingml/2006/main" xmlns:m="http://schemas.openxmlformats.org/officeDocument/2006/math" xmlns:r="http://schemas.openxmlformats.org/officeDocument/2006/relationships" xmlns:o="urn:schemas-microsoft-com:office:office" xmlns:v="urn:schemas-microsoft-com:vml" xmlns:w10="urn:schemas-microsoft-com:office:word" xmlns:a="http://schemas.openxmlformats.org/drawingml/2006/main" xmlns:pic="http://schemas.openxmlformats.org/drawingml/2006/picture" xmlns:wp="http://schemas.openxmlformats.org/drawingml/2006/wordprocessingDrawing"/>
 </file>
 
-<file path=word/footer1.xml><?xml version="1.0" encoding="utf-8"?>
-<w:ftr xmlns:mc="http://schemas.openxmlformats.org/markup-compatibility/2006" xmlns:o="urn:schemas-microsoft-com:office:office" xmlns:r="http://schemas.openxmlformats.org/officeDocument/2006/relationships" xmlns:m="http://schemas.openxmlformats.org/officeDocument/2006/math" xmlns:v="urn:schemas-microsoft-com:vml" xmlns:wp="http://schemas.openxmlformats.org/drawingml/2006/wordprocessingDrawing" xmlns:w10="urn:schemas-microsoft-com:office:word" xmlns:w="http://schemas.openxmlformats.org/wordprocessingml/2006/main" xmlns:wne="http://schemas.microsoft.com/office/word/2006/wordml" xmlns:sl="http://schemas.openxmlformats.org/schemaLibrary/2006/main" xmlns:a="http://schemas.openxmlformats.org/drawingml/2006/main" xmlns:pic="http://schemas.openxmlformats.org/drawingml/2006/picture" xmlns:c="http://schemas.openxmlformats.org/drawingml/2006/chart" xmlns:lc="http://schemas.openxmlformats.org/drawingml/2006/lockedCanvas" xmlns:dgm="http://schemas.openxmlformats.org/drawingml/2006/diagram" xmlns:wps="http://schemas.microsoft.com/office/word/2010/wordprocessingShape" xmlns:wpg="http://schemas.microsoft.com/office/word/2010/wordprocessingGroup" xmlns:w14="http://schemas.microsoft.com/office/word/2010/wordml" xmlns:w15="http://schemas.microsoft.com/office/word/2012/wordml" xmlns:w16="http://schemas.microsoft.com/office/word/2018/wordml" xmlns:w16cex="http://schemas.microsoft.com/office/word/2018/wordml/cex" xmlns:w16cid="http://schemas.microsoft.com/office/word/2016/wordml/cid" xmlns="http://schemas.microsoft.com/office/tasks/2019/documenttasks" xmlns:cr="http://schemas.microsoft.com/office/comments/2020/reactions">
-  <w:p>
-    <w:pPr>
-      <w:rPr/>
-    </w:pPr>
-    <w:r>
-      <w:rPr>
-        <w:rtl w:val="0"/>
-      </w:rPr>
-    </w:r>
-  </w:p>
-</w:ftr>
-</file>
-
 <file path=word/footnotes.xml><?xml version="1.0" encoding="utf-8"?>
 <w:footnotes xmlns:w="http://schemas.openxmlformats.org/wordprocessingml/2006/main" xmlns:m="http://schemas.openxmlformats.org/officeDocument/2006/math" xmlns:r="http://schemas.openxmlformats.org/officeDocument/2006/relationships" xmlns:o="urn:schemas-microsoft-com:office:office" xmlns:v="urn:schemas-microsoft-com:vml" xmlns:w10="urn:schemas-microsoft-com:office:word" xmlns:a="http://schemas.openxmlformats.org/drawingml/2006/main" xmlns:pic="http://schemas.openxmlformats.org/drawingml/2006/picture" xmlns:wp="http://schemas.openxmlformats.org/drawingml/2006/wordprocessingDrawing">
   <w:footnote w:type="continuationSeparator" w:id="0">
@@ -1411,401 +1403,8 @@
 </w:footnotes>
 </file>
 
-<file path=word/header1.xml><?xml version="1.0" encoding="utf-8"?>
-<w:hdr xmlns:mc="http://schemas.openxmlformats.org/markup-compatibility/2006" xmlns:o="urn:schemas-microsoft-com:office:office" xmlns:r="http://schemas.openxmlformats.org/officeDocument/2006/relationships" xmlns:m="http://schemas.openxmlformats.org/officeDocument/2006/math" xmlns:v="urn:schemas-microsoft-com:vml" xmlns:wp="http://schemas.openxmlformats.org/drawingml/2006/wordprocessingDrawing" xmlns:w10="urn:schemas-microsoft-com:office:word" xmlns:w="http://schemas.openxmlformats.org/wordprocessingml/2006/main" xmlns:wne="http://schemas.microsoft.com/office/word/2006/wordml" xmlns:sl="http://schemas.openxmlformats.org/schemaLibrary/2006/main" xmlns:a="http://schemas.openxmlformats.org/drawingml/2006/main" xmlns:pic="http://schemas.openxmlformats.org/drawingml/2006/picture" xmlns:c="http://schemas.openxmlformats.org/drawingml/2006/chart" xmlns:lc="http://schemas.openxmlformats.org/drawingml/2006/lockedCanvas" xmlns:dgm="http://schemas.openxmlformats.org/drawingml/2006/diagram" xmlns:wps="http://schemas.microsoft.com/office/word/2010/wordprocessingShape" xmlns:wpg="http://schemas.microsoft.com/office/word/2010/wordprocessingGroup" xmlns:w14="http://schemas.microsoft.com/office/word/2010/wordml" xmlns:w15="http://schemas.microsoft.com/office/word/2012/wordml" xmlns:w16="http://schemas.microsoft.com/office/word/2018/wordml" xmlns:w16cex="http://schemas.microsoft.com/office/word/2018/wordml/cex" xmlns:w16cid="http://schemas.microsoft.com/office/word/2016/wordml/cid" xmlns="http://schemas.microsoft.com/office/tasks/2019/documenttasks" xmlns:cr="http://schemas.microsoft.com/office/comments/2020/reactions">
-  <w:p>
-    <w:pPr>
-      <w:widowControl w:val="0"/>
-      <w:spacing w:line="240" w:lineRule="auto"/>
-      <w:jc w:val="center"/>
-      <w:rPr>
-        <w:rFonts w:ascii="Spectral Medium" w:cs="Spectral Medium" w:eastAsia="Spectral Medium" w:hAnsi="Spectral Medium"/>
-        <w:sz w:val="28"/>
-        <w:szCs w:val="28"/>
-      </w:rPr>
-    </w:pPr>
-    <w:r>
-      <w:rPr>
-        <w:rFonts w:ascii="Spectral Medium" w:cs="Spectral Medium" w:eastAsia="Spectral Medium" w:hAnsi="Spectral Medium"/>
-        <w:sz w:val="32"/>
-        <w:szCs w:val="32"/>
-        <w:rtl w:val="0"/>
-      </w:rPr>
-      <w:t xml:space="preserve">HRITIK SINGH</w:t>
-    </w:r>
-    <w:r>
-      <w:rPr>
-        <w:rtl w:val="0"/>
-      </w:rPr>
-    </w:r>
-  </w:p>
-  <w:p>
-    <w:pPr>
-      <w:widowControl w:val="0"/>
-      <w:spacing w:line="240" w:lineRule="auto"/>
-      <w:jc w:val="center"/>
-      <w:rPr>
-        <w:rFonts w:ascii="Spectral" w:cs="Spectral" w:eastAsia="Spectral" w:hAnsi="Spectral"/>
-        <w:color w:val="45818e"/>
-        <w:sz w:val="20"/>
-        <w:szCs w:val="20"/>
-      </w:rPr>
-    </w:pPr>
-    <w:r>
-      <w:rPr>
-        <w:rFonts w:ascii="Spectral" w:cs="Spectral" w:eastAsia="Spectral" w:hAnsi="Spectral"/>
-        <w:sz w:val="20"/>
-        <w:szCs w:val="20"/>
-      </w:rPr>
-      <w:drawing>
-        <wp:inline distB="114300" distT="114300" distL="114300" distR="114300">
-          <wp:extent cx="91440" cy="91440"/>
-          <wp:effectExtent b="0" l="0" r="0" t="0"/>
-          <wp:docPr id="5" name="image1.png"/>
-          <a:graphic>
-            <a:graphicData uri="http://schemas.openxmlformats.org/drawingml/2006/picture">
-              <pic:pic>
-                <pic:nvPicPr>
-                  <pic:cNvPr id="0" name="image1.png"/>
-                  <pic:cNvPicPr preferRelativeResize="0"/>
-                </pic:nvPicPr>
-                <pic:blipFill>
-                  <a:blip r:embed="rId1"/>
-                  <a:srcRect b="0" l="0" r="0" t="0"/>
-                  <a:stretch>
-                    <a:fillRect/>
-                  </a:stretch>
-                </pic:blipFill>
-                <pic:spPr>
-                  <a:xfrm>
-                    <a:off x="0" y="0"/>
-                    <a:ext cx="91440" cy="91440"/>
-                  </a:xfrm>
-                  <a:prstGeom prst="rect"/>
-                  <a:ln/>
-                </pic:spPr>
-              </pic:pic>
-            </a:graphicData>
-          </a:graphic>
-        </wp:inline>
-      </w:drawing>
-    </w:r>
-    <w:r>
-      <w:rPr>
-        <w:rFonts w:ascii="Spectral" w:cs="Spectral" w:eastAsia="Spectral" w:hAnsi="Spectral"/>
-        <w:sz w:val="20"/>
-        <w:szCs w:val="20"/>
-        <w:rtl w:val="0"/>
-      </w:rPr>
-      <w:t xml:space="preserve"> </w:t>
-    </w:r>
-    <w:hyperlink r:id="rId2">
-      <w:r>
-        <w:rPr>
-          <w:rFonts w:ascii="Spectral" w:cs="Spectral" w:eastAsia="Spectral" w:hAnsi="Spectral"/>
-          <w:color w:val="1155cc"/>
-          <w:sz w:val="20"/>
-          <w:szCs w:val="20"/>
-          <w:u w:val="single"/>
-          <w:rtl w:val="0"/>
-        </w:rPr>
-        <w:t xml:space="preserve">LinkedIn</w:t>
-      </w:r>
-    </w:hyperlink>
-    <w:r>
-      <w:rPr>
-        <w:rFonts w:ascii="Spectral" w:cs="Spectral" w:eastAsia="Spectral" w:hAnsi="Spectral"/>
-        <w:sz w:val="20"/>
-        <w:szCs w:val="20"/>
-        <w:rtl w:val="0"/>
-      </w:rPr>
-      <w:t xml:space="preserve">  |  </w:t>
-    </w:r>
-    <w:r>
-      <w:rPr>
-        <w:rFonts w:ascii="Spectral" w:cs="Spectral" w:eastAsia="Spectral" w:hAnsi="Spectral"/>
-        <w:sz w:val="20"/>
-        <w:szCs w:val="20"/>
-      </w:rPr>
-      <w:drawing>
-        <wp:inline distB="114300" distT="114300" distL="114300" distR="114300">
-          <wp:extent cx="91440" cy="91440"/>
-          <wp:effectExtent b="0" l="0" r="0" t="0"/>
-          <wp:docPr id="4" name="image2.png"/>
-          <a:graphic>
-            <a:graphicData uri="http://schemas.openxmlformats.org/drawingml/2006/picture">
-              <pic:pic>
-                <pic:nvPicPr>
-                  <pic:cNvPr id="0" name="image2.png"/>
-                  <pic:cNvPicPr preferRelativeResize="0"/>
-                </pic:nvPicPr>
-                <pic:blipFill>
-                  <a:blip r:embed="rId3"/>
-                  <a:srcRect b="0" l="0" r="0" t="0"/>
-                  <a:stretch>
-                    <a:fillRect/>
-                  </a:stretch>
-                </pic:blipFill>
-                <pic:spPr>
-                  <a:xfrm>
-                    <a:off x="0" y="0"/>
-                    <a:ext cx="91440" cy="91440"/>
-                  </a:xfrm>
-                  <a:prstGeom prst="rect"/>
-                  <a:ln/>
-                </pic:spPr>
-              </pic:pic>
-            </a:graphicData>
-          </a:graphic>
-        </wp:inline>
-      </w:drawing>
-    </w:r>
-    <w:r>
-      <w:rPr>
-        <w:rFonts w:ascii="Spectral" w:cs="Spectral" w:eastAsia="Spectral" w:hAnsi="Spectral"/>
-        <w:color w:val="0f0f0f"/>
-        <w:sz w:val="20"/>
-        <w:szCs w:val="20"/>
-        <w:rtl w:val="0"/>
-      </w:rPr>
-      <w:t xml:space="preserve">8210244533</w:t>
-    </w:r>
-    <w:r>
-      <w:rPr>
-        <w:rFonts w:ascii="Spectral" w:cs="Spectral" w:eastAsia="Spectral" w:hAnsi="Spectral"/>
-        <w:sz w:val="20"/>
-        <w:szCs w:val="20"/>
-        <w:rtl w:val="0"/>
-      </w:rPr>
-      <w:t xml:space="preserve">  |  </w:t>
-    </w:r>
-    <w:r>
-      <w:rPr>
-        <w:rFonts w:ascii="Spectral" w:cs="Spectral" w:eastAsia="Spectral" w:hAnsi="Spectral"/>
-        <w:sz w:val="20"/>
-        <w:szCs w:val="20"/>
-      </w:rPr>
-      <w:drawing>
-        <wp:inline distB="114300" distT="114300" distL="114300" distR="114300">
-          <wp:extent cx="91440" cy="91440"/>
-          <wp:effectExtent b="0" l="0" r="0" t="0"/>
-          <wp:docPr id="3" name="image5.png"/>
-          <a:graphic>
-            <a:graphicData uri="http://schemas.openxmlformats.org/drawingml/2006/picture">
-              <pic:pic>
-                <pic:nvPicPr>
-                  <pic:cNvPr id="0" name="image5.png"/>
-                  <pic:cNvPicPr preferRelativeResize="0"/>
-                </pic:nvPicPr>
-                <pic:blipFill>
-                  <a:blip r:embed="rId4"/>
-                  <a:srcRect b="0" l="0" r="0" t="0"/>
-                  <a:stretch>
-                    <a:fillRect/>
-                  </a:stretch>
-                </pic:blipFill>
-                <pic:spPr>
-                  <a:xfrm>
-                    <a:off x="0" y="0"/>
-                    <a:ext cx="91440" cy="91440"/>
-                  </a:xfrm>
-                  <a:prstGeom prst="rect"/>
-                  <a:ln/>
-                </pic:spPr>
-              </pic:pic>
-            </a:graphicData>
-          </a:graphic>
-        </wp:inline>
-      </w:drawing>
-    </w:r>
-    <w:hyperlink r:id="rId5">
-      <w:r>
-        <w:rPr>
-          <w:rFonts w:ascii="Spectral" w:cs="Spectral" w:eastAsia="Spectral" w:hAnsi="Spectral"/>
-          <w:color w:val="1155cc"/>
-          <w:sz w:val="20"/>
-          <w:szCs w:val="20"/>
-          <w:u w:val="single"/>
-          <w:rtl w:val="0"/>
-        </w:rPr>
-        <w:t xml:space="preserve"> hritik3447@gmail.com</w:t>
-      </w:r>
-    </w:hyperlink>
-    <w:r>
-      <w:rPr>
-        <w:rFonts w:ascii="Spectral" w:cs="Spectral" w:eastAsia="Spectral" w:hAnsi="Spectral"/>
-        <w:sz w:val="20"/>
-        <w:szCs w:val="20"/>
-        <w:rtl w:val="0"/>
-      </w:rPr>
-      <w:t xml:space="preserve">  |   </w:t>
-    </w:r>
-    <w:r>
-      <w:rPr>
-        <w:rFonts w:ascii="Spectral" w:cs="Spectral" w:eastAsia="Spectral" w:hAnsi="Spectral"/>
-        <w:sz w:val="20"/>
-        <w:szCs w:val="20"/>
-      </w:rPr>
-      <w:drawing>
-        <wp:inline distB="114300" distT="114300" distL="114300" distR="114300">
-          <wp:extent cx="91440" cy="91440"/>
-          <wp:effectExtent b="0" l="0" r="0" t="0"/>
-          <wp:docPr id="1" name="image4.png"/>
-          <a:graphic>
-            <a:graphicData uri="http://schemas.openxmlformats.org/drawingml/2006/picture">
-              <pic:pic>
-                <pic:nvPicPr>
-                  <pic:cNvPr id="0" name="image4.png"/>
-                  <pic:cNvPicPr preferRelativeResize="0"/>
-                </pic:nvPicPr>
-                <pic:blipFill>
-                  <a:blip r:embed="rId6"/>
-                  <a:srcRect b="0" l="0" r="0" t="0"/>
-                  <a:stretch>
-                    <a:fillRect/>
-                  </a:stretch>
-                </pic:blipFill>
-                <pic:spPr>
-                  <a:xfrm>
-                    <a:off x="0" y="0"/>
-                    <a:ext cx="91440" cy="91440"/>
-                  </a:xfrm>
-                  <a:prstGeom prst="rect"/>
-                  <a:ln/>
-                </pic:spPr>
-              </pic:pic>
-            </a:graphicData>
-          </a:graphic>
-        </wp:inline>
-      </w:drawing>
-    </w:r>
-    <w:r>
-      <w:rPr>
-        <w:rFonts w:ascii="Spectral" w:cs="Spectral" w:eastAsia="Spectral" w:hAnsi="Spectral"/>
-        <w:sz w:val="20"/>
-        <w:szCs w:val="20"/>
-        <w:rtl w:val="0"/>
-      </w:rPr>
-      <w:t xml:space="preserve"> </w:t>
-    </w:r>
-    <w:hyperlink r:id="rId7">
-      <w:r>
-        <w:rPr>
-          <w:rFonts w:ascii="Spectral" w:cs="Spectral" w:eastAsia="Spectral" w:hAnsi="Spectral"/>
-          <w:color w:val="1155cc"/>
-          <w:sz w:val="20"/>
-          <w:szCs w:val="20"/>
-          <w:u w:val="single"/>
-          <w:rtl w:val="0"/>
-        </w:rPr>
-        <w:t xml:space="preserve">LeetCode </w:t>
-      </w:r>
-    </w:hyperlink>
-    <w:r>
-      <w:rPr>
-        <w:rFonts w:ascii="Spectral" w:cs="Spectral" w:eastAsia="Spectral" w:hAnsi="Spectral"/>
-        <w:sz w:val="20"/>
-        <w:szCs w:val="20"/>
-        <w:rtl w:val="0"/>
-      </w:rPr>
-      <w:t xml:space="preserve">  </w:t>
-    </w:r>
-    <w:r>
-      <w:rPr>
-        <w:rFonts w:ascii="Spectral" w:cs="Spectral" w:eastAsia="Spectral" w:hAnsi="Spectral"/>
-        <w:sz w:val="20"/>
-        <w:szCs w:val="20"/>
-        <w:rtl w:val="0"/>
-      </w:rPr>
-      <w:t xml:space="preserve">|   </w:t>
-    </w:r>
-    <w:r>
-      <w:rPr>
-        <w:rFonts w:ascii="Spectral" w:cs="Spectral" w:eastAsia="Spectral" w:hAnsi="Spectral"/>
-        <w:sz w:val="20"/>
-        <w:szCs w:val="20"/>
-      </w:rPr>
-      <w:drawing>
-        <wp:inline distB="114300" distT="114300" distL="114300" distR="114300">
-          <wp:extent cx="100584" cy="100584"/>
-          <wp:effectExtent b="0" l="0" r="0" t="0"/>
-          <wp:docPr id="2" name="image3.png"/>
-          <a:graphic>
-            <a:graphicData uri="http://schemas.openxmlformats.org/drawingml/2006/picture">
-              <pic:pic>
-                <pic:nvPicPr>
-                  <pic:cNvPr id="0" name="image3.png"/>
-                  <pic:cNvPicPr preferRelativeResize="0"/>
-                </pic:nvPicPr>
-                <pic:blipFill>
-                  <a:blip r:embed="rId8"/>
-                  <a:srcRect b="0" l="0" r="0" t="0"/>
-                  <a:stretch>
-                    <a:fillRect/>
-                  </a:stretch>
-                </pic:blipFill>
-                <pic:spPr>
-                  <a:xfrm>
-                    <a:off x="0" y="0"/>
-                    <a:ext cx="100584" cy="100584"/>
-                  </a:xfrm>
-                  <a:prstGeom prst="rect"/>
-                  <a:ln/>
-                </pic:spPr>
-              </pic:pic>
-            </a:graphicData>
-          </a:graphic>
-        </wp:inline>
-      </w:drawing>
-    </w:r>
-    <w:r>
-      <w:rPr>
-        <w:rFonts w:ascii="Spectral" w:cs="Spectral" w:eastAsia="Spectral" w:hAnsi="Spectral"/>
-        <w:sz w:val="20"/>
-        <w:szCs w:val="20"/>
-        <w:rtl w:val="0"/>
-      </w:rPr>
-      <w:t xml:space="preserve"> </w:t>
-    </w:r>
-    <w:hyperlink r:id="rId9">
-      <w:r>
-        <w:rPr>
-          <w:rFonts w:ascii="Spectral" w:cs="Spectral" w:eastAsia="Spectral" w:hAnsi="Spectral"/>
-          <w:color w:val="1155cc"/>
-          <w:sz w:val="20"/>
-          <w:szCs w:val="20"/>
-          <w:u w:val="single"/>
-          <w:rtl w:val="0"/>
-        </w:rPr>
-        <w:t xml:space="preserve">GitHub</w:t>
-      </w:r>
-    </w:hyperlink>
-    <w:r>
-      <w:rPr>
-        <w:rtl w:val="0"/>
-      </w:rPr>
-    </w:r>
-  </w:p>
-</w:hdr>
-</file>
-
-<file path=word/header2.xml><?xml version="1.0" encoding="utf-8"?>
-<w:hdr xmlns:mc="http://schemas.openxmlformats.org/markup-compatibility/2006" xmlns:o="urn:schemas-microsoft-com:office:office" xmlns:r="http://schemas.openxmlformats.org/officeDocument/2006/relationships" xmlns:m="http://schemas.openxmlformats.org/officeDocument/2006/math" xmlns:v="urn:schemas-microsoft-com:vml" xmlns:wp="http://schemas.openxmlformats.org/drawingml/2006/wordprocessingDrawing" xmlns:w10="urn:schemas-microsoft-com:office:word" xmlns:w="http://schemas.openxmlformats.org/wordprocessingml/2006/main" xmlns:wne="http://schemas.microsoft.com/office/word/2006/wordml" xmlns:sl="http://schemas.openxmlformats.org/schemaLibrary/2006/main" xmlns:a="http://schemas.openxmlformats.org/drawingml/2006/main" xmlns:pic="http://schemas.openxmlformats.org/drawingml/2006/picture" xmlns:c="http://schemas.openxmlformats.org/drawingml/2006/chart" xmlns:lc="http://schemas.openxmlformats.org/drawingml/2006/lockedCanvas" xmlns:dgm="http://schemas.openxmlformats.org/drawingml/2006/diagram" xmlns:wps="http://schemas.microsoft.com/office/word/2010/wordprocessingShape" xmlns:wpg="http://schemas.microsoft.com/office/word/2010/wordprocessingGroup" xmlns:w14="http://schemas.microsoft.com/office/word/2010/wordml" xmlns:w15="http://schemas.microsoft.com/office/word/2012/wordml" xmlns:w16="http://schemas.microsoft.com/office/word/2018/wordml" xmlns:w16cex="http://schemas.microsoft.com/office/word/2018/wordml/cex" xmlns:w16cid="http://schemas.microsoft.com/office/word/2016/wordml/cid" xmlns="http://schemas.microsoft.com/office/tasks/2019/documenttasks" xmlns:cr="http://schemas.microsoft.com/office/comments/2020/reactions">
-  <w:p>
-    <w:pPr>
-      <w:rPr/>
-    </w:pPr>
-    <w:r>
-      <w:rPr>
-        <w:rtl w:val="0"/>
-      </w:rPr>
-    </w:r>
-  </w:p>
-</w:hdr>
-</file>
-
 <file path=word/numbering.xml><?xml version="1.0" encoding="utf-8"?>
-<w:numbering xmlns="http://schemas.microsoft.com/office/tasks/2019/documenttasks" xmlns:a="http://schemas.openxmlformats.org/drawingml/2006/main" xmlns:c="http://schemas.openxmlformats.org/drawingml/2006/chart" xmlns:cr="http://schemas.microsoft.com/office/comments/2020/reactions" xmlns:dgm="http://schemas.openxmlformats.org/drawingml/2006/diagram" xmlns:lc="http://schemas.openxmlformats.org/drawingml/2006/lockedCanvas" xmlns:m="http://schemas.openxmlformats.org/officeDocument/2006/math" xmlns:mc="http://schemas.openxmlformats.org/markup-compatibility/2006" xmlns:o="urn:schemas-microsoft-com:office:office" xmlns:pic="http://schemas.openxmlformats.org/drawingml/2006/picture" xmlns:r="http://schemas.openxmlformats.org/officeDocument/2006/relationships" xmlns:sl="http://schemas.openxmlformats.org/schemaLibrary/2006/main" xmlns:v="urn:schemas-microsoft-com:vml" xmlns:w="http://schemas.openxmlformats.org/wordprocessingml/2006/main" xmlns:w10="urn:schemas-microsoft-com:office:word" xmlns:w14="http://schemas.microsoft.com/office/word/2010/wordml" xmlns:w15="http://schemas.microsoft.com/office/word/2012/wordml" xmlns:w16="http://schemas.microsoft.com/office/word/2018/wordml" xmlns:w16cex="http://schemas.microsoft.com/office/word/2018/wordml/cex" xmlns:w16cid="http://schemas.microsoft.com/office/word/2016/wordml/cid" xmlns:wne="http://schemas.microsoft.com/office/word/2006/wordml" xmlns:wp="http://schemas.openxmlformats.org/drawingml/2006/wordprocessingDrawing" xmlns:wpg="http://schemas.microsoft.com/office/word/2010/wordprocessingGroup" xmlns:wps="http://schemas.microsoft.com/office/word/2010/wordprocessingShape">
+<w:numbering xmlns:w="http://schemas.openxmlformats.org/wordprocessingml/2006/main">
   <w:abstractNum w:abstractNumId="990">
     <w:nsid w:val="A990"/>
     <w:multiLevelType w:val="multilevel"/>
@@ -1995,521 +1594,490 @@
 </file>
 
 <file path=word/styles.xml><?xml version="1.0" encoding="utf-8"?>
-<w:styles xmlns="http://schemas.microsoft.com/office/tasks/2019/documenttasks" xmlns:a="http://schemas.openxmlformats.org/drawingml/2006/main" xmlns:c="http://schemas.openxmlformats.org/drawingml/2006/chart" xmlns:cr="http://schemas.microsoft.com/office/comments/2020/reactions" xmlns:dgm="http://schemas.openxmlformats.org/drawingml/2006/diagram" xmlns:lc="http://schemas.openxmlformats.org/drawingml/2006/lockedCanvas" xmlns:m="http://schemas.openxmlformats.org/officeDocument/2006/math" xmlns:mc="http://schemas.openxmlformats.org/markup-compatibility/2006" xmlns:o="urn:schemas-microsoft-com:office:office" xmlns:pic="http://schemas.openxmlformats.org/drawingml/2006/picture" xmlns:r="http://schemas.openxmlformats.org/officeDocument/2006/relationships" xmlns:sl="http://schemas.openxmlformats.org/schemaLibrary/2006/main" xmlns:v="urn:schemas-microsoft-com:vml" xmlns:w="http://schemas.openxmlformats.org/wordprocessingml/2006/main" xmlns:w10="urn:schemas-microsoft-com:office:word" xmlns:w14="http://schemas.microsoft.com/office/word/2010/wordml" xmlns:w15="http://schemas.microsoft.com/office/word/2012/wordml" xmlns:w16="http://schemas.microsoft.com/office/word/2018/wordml" xmlns:w16cex="http://schemas.microsoft.com/office/word/2018/wordml/cex" xmlns:w16cid="http://schemas.microsoft.com/office/word/2016/wordml/cid" xmlns:wne="http://schemas.microsoft.com/office/word/2006/wordml" xmlns:wp="http://schemas.openxmlformats.org/drawingml/2006/wordprocessingDrawing" xmlns:wpg="http://schemas.microsoft.com/office/word/2010/wordprocessingGroup" xmlns:wps="http://schemas.microsoft.com/office/word/2010/wordprocessingShape">
+<w:styles xmlns:r="http://schemas.openxmlformats.org/officeDocument/2006/relationships" xmlns:w="http://schemas.openxmlformats.org/wordprocessingml/2006/main">
   <w:docDefaults>
     <w:rPrDefault>
       <w:rPr>
-        <w:rFonts w:ascii="Arial" w:cs="Arial" w:eastAsia="Arial" w:hAnsi="Arial"/>
-        <w:sz w:val="22"/>
-        <w:szCs w:val="22"/>
-        <w:lang w:val="en"/>
+        <w:rFonts w:asciiTheme="minorHAnsi" w:cstheme="minorBidi" w:eastAsiaTheme="minorHAnsi" w:hAnsiTheme="minorHAnsi"/>
+        <w:sz w:val="24"/>
+        <w:szCs w:val="24"/>
+        <w:lang w:bidi="ar-SA" w:eastAsia="en-US" w:val="en-US"/>
       </w:rPr>
     </w:rPrDefault>
     <w:pPrDefault>
       <w:pPr>
-        <w:spacing w:line="276" w:lineRule="auto"/>
+        <w:spacing w:after="200"/>
       </w:pPr>
     </w:pPrDefault>
   </w:docDefaults>
-  <w:style w:default="1" w:styleId="TableNormal" w:type="table">
-    <w:name w:val="TableNormal"/>
-    <w:tblPr>
-      <w:tblCellMar>
-        <w:top w:type="dxa" w:w="100.0"/>
-        <w:left w:type="dxa" w:w="100.0"/>
-        <w:bottom w:type="dxa" w:w="100.0"/>
-        <w:right w:type="dxa" w:w="100.0"/>
-      </w:tblCellMar>
-    </w:tblPr>
-  </w:style>
+  <w:latentStyles w:count="276" w:defLockedState="0" w:defQFormat="0" w:defSemiHidden="0" w:defUIPriority="0" w:defUnhideWhenUsed="0"/>
   <w:style w:default="1" w:styleId="Normal" w:type="paragraph">
-    <w:name w:val="normal"/>
-  </w:style>
-  <w:style w:styleId="Heading1" w:type="paragraph">
-    <w:name w:val="heading 1"/>
+    <w:name w:val="Normal"/>
+    <w:qFormat/>
+  </w:style>
+  <w:style w:styleId="BodyText" w:type="paragraph">
+    <w:name w:val="Body Text"/>
     <w:basedOn w:val="Normal"/>
-    <w:next w:val="Normal"/>
+    <w:link w:val="BodyTextChar"/>
     <w:pPr>
-      <w:keepNext w:val="1"/>
-      <w:keepLines w:val="1"/>
-      <w:pageBreakBefore w:val="0"/>
-      <w:spacing w:after="120" w:before="400" w:lineRule="auto"/>
+      <w:spacing w:after="180" w:before="180"/>
     </w:pPr>
-    <w:rPr>
-      <w:sz w:val="40"/>
-      <w:szCs w:val="40"/>
-    </w:rPr>
-  </w:style>
-  <w:style w:styleId="Heading2" w:type="paragraph">
-    <w:name w:val="heading 2"/>
-    <w:basedOn w:val="Normal"/>
-    <w:next w:val="Normal"/>
+    <w:qFormat/>
+  </w:style>
+  <w:style w:customStyle="1" w:styleId="FirstParagraph" w:type="paragraph">
+    <w:name w:val="First Paragraph"/>
+    <w:basedOn w:val="BodyText"/>
+    <w:next w:val="BodyText"/>
+    <w:qFormat/>
+  </w:style>
+  <w:style w:customStyle="1" w:styleId="Compact" w:type="paragraph">
+    <w:name w:val="Compact"/>
+    <w:basedOn w:val="BodyText"/>
+    <w:qFormat/>
     <w:pPr>
-      <w:keepNext w:val="1"/>
-      <w:keepLines w:val="1"/>
-      <w:pageBreakBefore w:val="0"/>
-      <w:spacing w:after="120" w:before="360" w:lineRule="auto"/>
+      <w:spacing w:after="36" w:before="36"/>
     </w:pPr>
-    <w:rPr>
-      <w:b w:val="0"/>
-      <w:bCs w:val="0"/>
-      <w:sz w:val="32"/>
-      <w:szCs w:val="32"/>
-    </w:rPr>
-  </w:style>
-  <w:style w:styleId="Heading3" w:type="paragraph">
-    <w:name w:val="heading 3"/>
-    <w:basedOn w:val="Normal"/>
-    <w:next w:val="Normal"/>
-    <w:pPr>
-      <w:keepNext w:val="1"/>
-      <w:keepLines w:val="1"/>
-      <w:pageBreakBefore w:val="0"/>
-      <w:spacing w:after="80" w:before="320" w:lineRule="auto"/>
-    </w:pPr>
-    <w:rPr>
-      <w:b w:val="0"/>
-      <w:bCs w:val="0"/>
-      <w:color w:val="434343"/>
-      <w:sz w:val="28"/>
-      <w:szCs w:val="28"/>
-    </w:rPr>
-  </w:style>
-  <w:style w:styleId="Heading4" w:type="paragraph">
-    <w:name w:val="heading 4"/>
-    <w:basedOn w:val="Normal"/>
-    <w:next w:val="Normal"/>
-    <w:pPr>
-      <w:keepNext w:val="1"/>
-      <w:keepLines w:val="1"/>
-      <w:pageBreakBefore w:val="0"/>
-      <w:spacing w:after="80" w:before="280" w:lineRule="auto"/>
-    </w:pPr>
-    <w:rPr>
-      <w:color w:val="666666"/>
-      <w:sz w:val="24"/>
-      <w:szCs w:val="24"/>
-    </w:rPr>
-  </w:style>
-  <w:style w:styleId="Heading5" w:type="paragraph">
-    <w:name w:val="heading 5"/>
-    <w:basedOn w:val="Normal"/>
-    <w:next w:val="Normal"/>
-    <w:pPr>
-      <w:keepNext w:val="1"/>
-      <w:keepLines w:val="1"/>
-      <w:pageBreakBefore w:val="0"/>
-      <w:spacing w:after="80" w:before="240" w:lineRule="auto"/>
-    </w:pPr>
-    <w:rPr>
-      <w:color w:val="666666"/>
-      <w:sz w:val="22"/>
-      <w:szCs w:val="22"/>
-    </w:rPr>
-  </w:style>
-  <w:style w:styleId="Heading6" w:type="paragraph">
-    <w:name w:val="heading 6"/>
-    <w:basedOn w:val="Normal"/>
-    <w:next w:val="Normal"/>
-    <w:pPr>
-      <w:keepNext w:val="1"/>
-      <w:keepLines w:val="1"/>
-      <w:pageBreakBefore w:val="0"/>
-      <w:spacing w:after="80" w:before="240" w:lineRule="auto"/>
-    </w:pPr>
-    <w:rPr>
-      <w:i w:val="1"/>
-      <w:iCs w:val="1"/>
-      <w:color w:val="666666"/>
-      <w:sz w:val="22"/>
-      <w:szCs w:val="22"/>
-    </w:rPr>
   </w:style>
   <w:style w:styleId="Title" w:type="paragraph">
     <w:name w:val="Title"/>
     <w:basedOn w:val="Normal"/>
-    <w:next w:val="Normal"/>
+    <w:next w:val="BodyText"/>
+    <w:qFormat/>
     <w:pPr>
-      <w:keepNext w:val="1"/>
-      <w:keepLines w:val="1"/>
-      <w:pageBreakBefore w:val="0"/>
-      <w:spacing w:after="60" w:before="0" w:lineRule="auto"/>
+      <w:keepNext/>
+      <w:keepLines/>
+      <w:spacing w:after="240" w:before="480"/>
+      <w:jc w:val="center"/>
     </w:pPr>
     <w:rPr>
-      <w:sz w:val="52"/>
-      <w:szCs w:val="52"/>
+      <w:rFonts w:asciiTheme="majorHAnsi" w:cstheme="majorBidi" w:eastAsiaTheme="majorEastAsia" w:hAnsiTheme="majorHAnsi"/>
+      <w:b/>
+      <w:bCs/>
+      <w:color w:themeColor="accent1" w:themeShade="B5" w:val="345A8A"/>
+      <w:sz w:val="36"/>
+      <w:szCs w:val="36"/>
     </w:rPr>
   </w:style>
   <w:style w:styleId="Subtitle" w:type="paragraph">
     <w:name w:val="Subtitle"/>
-    <w:basedOn w:val="Normal"/>
-    <w:next w:val="Normal"/>
+    <w:basedOn w:val="Title"/>
+    <w:next w:val="BodyText"/>
+    <w:qFormat/>
     <w:pPr>
-      <w:keepNext w:val="1"/>
-      <w:keepLines w:val="1"/>
-      <w:pageBreakBefore w:val="0"/>
-      <w:spacing w:after="320" w:before="0" w:lineRule="auto"/>
+      <w:keepNext/>
+      <w:keepLines/>
+      <w:spacing w:after="240" w:before="240"/>
+      <w:jc w:val="center"/>
     </w:pPr>
     <w:rPr>
-      <w:rFonts w:ascii="Arial" w:cs="Arial" w:eastAsia="Arial" w:hAnsi="Arial"/>
-      <w:i w:val="0"/>
-      <w:iCs w:val="0"/>
-      <w:color w:val="666666"/>
       <w:sz w:val="30"/>
       <w:szCs w:val="30"/>
     </w:rPr>
   </w:style>
-  <w:style w:styleId="Table1" w:type="table">
+  <w:style w:customStyle="1" w:styleId="Author" w:type="paragraph">
+    <w:name w:val="Author"/>
+    <w:next w:val="BodyText"/>
+    <w:qFormat/>
+    <w:pPr>
+      <w:keepNext/>
+      <w:keepLines/>
+      <w:jc w:val="center"/>
+    </w:pPr>
+  </w:style>
+  <w:style w:styleId="Date" w:type="paragraph">
+    <w:name w:val="Date"/>
+    <w:next w:val="BodyText"/>
+    <w:qFormat/>
+    <w:pPr>
+      <w:keepNext/>
+      <w:keepLines/>
+      <w:jc w:val="center"/>
+    </w:pPr>
+  </w:style>
+  <w:style w:customStyle="1" w:styleId="AbstractTitle" w:type="paragraph">
+    <w:name w:val="Abstract Title"/>
+    <w:basedOn w:val="Normal"/>
+    <w:next w:val="Abstract"/>
+    <w:qFormat/>
+    <w:pPr>
+      <w:keepNext/>
+      <w:keepLines/>
+      <w:jc w:val="center"/>
+      <w:spacing w:after="0" w:before="300"/>
+    </w:pPr>
+    <w:rPr>
+      <w:sz w:val="20"/>
+      <w:szCs w:val="20"/>
+      <w:b/>
+      <w:color w:val="345A8A"/>
+      &gt;
+    </w:rPr>
+  </w:style>
+  <w:style w:customStyle="1" w:styleId="Abstract" w:type="paragraph">
+    <w:name w:val="Abstract"/>
+    <w:basedOn w:val="Normal"/>
+    <w:next w:val="BodyText"/>
+    <w:qFormat/>
+    <w:pPr>
+      <w:keepNext/>
+      <w:keepLines/>
+      <w:spacing w:after="300" w:before="100"/>
+    </w:pPr>
+    <w:rPr>
+      <w:sz w:val="20"/>
+      <w:szCs w:val="20"/>
+    </w:rPr>
+  </w:style>
+  <w:style w:styleId="Bibliography" w:type="paragraph">
+    <w:name w:val="Bibliography"/>
+    <w:basedOn w:val="Normal"/>
+    <w:next w:val="Bibliography"/>
+    <w:qFormat/>
+    <w:pPr/>
+    <w:rPr/>
+  </w:style>
+  <w:style w:styleId="Heading1" w:type="paragraph">
+    <w:name w:val="Heading 1"/>
+    <w:basedOn w:val="Normal"/>
+    <w:next w:val="BodyText"/>
+    <w:uiPriority w:val="9"/>
+    <w:qFormat/>
+    <w:pPr>
+      <w:keepNext/>
+      <w:keepLines/>
+      <w:spacing w:after="0" w:before="480"/>
+      <w:outlineLvl w:val="0"/>
+    </w:pPr>
+    <w:rPr>
+      <w:rFonts w:asciiTheme="majorHAnsi" w:cstheme="majorBidi" w:eastAsiaTheme="majorEastAsia" w:hAnsiTheme="majorHAnsi"/>
+      <w:b/>
+      <w:bCs/>
+      <w:color w:themeColor="accent1" w:val="4F81BD"/>
+      <w:sz w:val="32"/>
+      <w:szCs w:val="32"/>
+    </w:rPr>
+  </w:style>
+  <w:style w:styleId="Heading2" w:type="paragraph">
+    <w:name w:val="Heading 2"/>
+    <w:basedOn w:val="Normal"/>
+    <w:next w:val="BodyText"/>
+    <w:uiPriority w:val="9"/>
+    <w:unhideWhenUsed/>
+    <w:qFormat/>
+    <w:pPr>
+      <w:keepNext/>
+      <w:keepLines/>
+      <w:spacing w:after="0" w:before="200"/>
+      <w:outlineLvl w:val="1"/>
+    </w:pPr>
+    <w:rPr>
+      <w:rFonts w:asciiTheme="majorHAnsi" w:cstheme="majorBidi" w:eastAsiaTheme="majorEastAsia" w:hAnsiTheme="majorHAnsi"/>
+      <w:b/>
+      <w:bCs/>
+      <w:color w:themeColor="accent1" w:val="4F81BD"/>
+      <w:sz w:val="28"/>
+      <w:szCs w:val="28"/>
+    </w:rPr>
+  </w:style>
+  <w:style w:styleId="Heading3" w:type="paragraph">
+    <w:name w:val="Heading 3"/>
+    <w:basedOn w:val="Normal"/>
+    <w:next w:val="BodyText"/>
+    <w:uiPriority w:val="9"/>
+    <w:unhideWhenUsed/>
+    <w:qFormat/>
+    <w:pPr>
+      <w:keepNext/>
+      <w:keepLines/>
+      <w:spacing w:after="0" w:before="200"/>
+      <w:outlineLvl w:val="2"/>
+    </w:pPr>
+    <w:rPr>
+      <w:rFonts w:asciiTheme="majorHAnsi" w:cstheme="majorBidi" w:eastAsiaTheme="majorEastAsia" w:hAnsiTheme="majorHAnsi"/>
+      <w:b/>
+      <w:bCs/>
+      <w:color w:themeColor="accent1" w:val="4F81BD"/>
+      <w:sz w:val="24"/>
+      <w:szCs w:val="24"/>
+    </w:rPr>
+  </w:style>
+  <w:style w:styleId="Heading4" w:type="paragraph">
+    <w:name w:val="Heading 4"/>
+    <w:basedOn w:val="Normal"/>
+    <w:next w:val="BodyText"/>
+    <w:uiPriority w:val="9"/>
+    <w:unhideWhenUsed/>
+    <w:qFormat/>
+    <w:pPr>
+      <w:keepNext/>
+      <w:keepLines/>
+      <w:spacing w:after="0" w:before="200"/>
+      <w:outlineLvl w:val="3"/>
+    </w:pPr>
+    <w:rPr>
+      <w:rFonts w:asciiTheme="majorHAnsi" w:cstheme="majorBidi" w:eastAsiaTheme="majorEastAsia" w:hAnsiTheme="majorHAnsi"/>
+      <w:i/>
+      <w:bCs/>
+      <w:color w:themeColor="accent1" w:val="4F81BD"/>
+      <w:sz w:val="24"/>
+      <w:szCs w:val="24"/>
+    </w:rPr>
+  </w:style>
+  <w:style w:styleId="Heading5" w:type="paragraph">
+    <w:name w:val="Heading 5"/>
+    <w:basedOn w:val="Normal"/>
+    <w:next w:val="BodyText"/>
+    <w:uiPriority w:val="9"/>
+    <w:unhideWhenUsed/>
+    <w:qFormat/>
+    <w:pPr>
+      <w:keepNext/>
+      <w:keepLines/>
+      <w:spacing w:after="0" w:before="200"/>
+      <w:outlineLvl w:val="4"/>
+    </w:pPr>
+    <w:rPr>
+      <w:rFonts w:asciiTheme="majorHAnsi" w:cstheme="majorBidi" w:eastAsiaTheme="majorEastAsia" w:hAnsiTheme="majorHAnsi"/>
+      <w:iCs/>
+      <w:color w:themeColor="accent1" w:val="4F81BD"/>
+      <w:sz w:val="24"/>
+      <w:szCs w:val="24"/>
+    </w:rPr>
+  </w:style>
+  <w:style w:styleId="Heading6" w:type="paragraph">
+    <w:name w:val="Heading 6"/>
+    <w:basedOn w:val="Normal"/>
+    <w:next w:val="BodyText"/>
+    <w:uiPriority w:val="9"/>
+    <w:unhideWhenUsed/>
+    <w:qFormat/>
+    <w:pPr>
+      <w:keepNext/>
+      <w:keepLines/>
+      <w:spacing w:after="0" w:before="200"/>
+      <w:outlineLvl w:val="5"/>
+    </w:pPr>
+    <w:rPr>
+      <w:rFonts w:asciiTheme="majorHAnsi" w:cstheme="majorBidi" w:eastAsiaTheme="majorEastAsia" w:hAnsiTheme="majorHAnsi"/>
+      <w:color w:themeColor="accent1" w:val="4F81BD"/>
+      <w:sz w:val="24"/>
+      <w:szCs w:val="24"/>
+    </w:rPr>
+  </w:style>
+  <w:style w:styleId="Heading7" w:type="paragraph">
+    <w:name w:val="Heading 7"/>
+    <w:basedOn w:val="Normal"/>
+    <w:next w:val="BodyText"/>
+    <w:uiPriority w:val="9"/>
+    <w:unhideWhenUsed/>
+    <w:qFormat/>
+    <w:pPr>
+      <w:keepNext/>
+      <w:keepLines/>
+      <w:spacing w:after="0" w:before="200"/>
+      <w:outlineLvl w:val="6"/>
+    </w:pPr>
+    <w:rPr>
+      <w:rFonts w:asciiTheme="majorHAnsi" w:cstheme="majorBidi" w:eastAsiaTheme="majorEastAsia" w:hAnsiTheme="majorHAnsi"/>
+      <w:color w:themeColor="accent1" w:val="4F81BD"/>
+      <w:sz w:val="24"/>
+      <w:szCs w:val="24"/>
+    </w:rPr>
+  </w:style>
+  <w:style w:styleId="Heading8" w:type="paragraph">
+    <w:name w:val="Heading 8"/>
+    <w:basedOn w:val="Normal"/>
+    <w:next w:val="BodyText"/>
+    <w:uiPriority w:val="9"/>
+    <w:unhideWhenUsed/>
+    <w:qFormat/>
+    <w:pPr>
+      <w:keepNext/>
+      <w:keepLines/>
+      <w:spacing w:after="0" w:before="200"/>
+      <w:outlineLvl w:val="7"/>
+    </w:pPr>
+    <w:rPr>
+      <w:rFonts w:asciiTheme="majorHAnsi" w:cstheme="majorBidi" w:eastAsiaTheme="majorEastAsia" w:hAnsiTheme="majorHAnsi"/>
+      <w:color w:themeColor="accent1" w:val="4F81BD"/>
+      <w:sz w:val="24"/>
+      <w:szCs w:val="24"/>
+    </w:rPr>
+  </w:style>
+  <w:style w:styleId="Heading9" w:type="paragraph">
+    <w:name w:val="Heading 9"/>
+    <w:basedOn w:val="Normal"/>
+    <w:next w:val="BodyText"/>
+    <w:uiPriority w:val="9"/>
+    <w:unhideWhenUsed/>
+    <w:qFormat/>
+    <w:pPr>
+      <w:keepNext/>
+      <w:keepLines/>
+      <w:spacing w:after="0" w:before="200"/>
+      <w:outlineLvl w:val="8"/>
+    </w:pPr>
+    <w:rPr>
+      <w:rFonts w:asciiTheme="majorHAnsi" w:cstheme="majorBidi" w:eastAsiaTheme="majorEastAsia" w:hAnsiTheme="majorHAnsi"/>
+      <w:color w:themeColor="accent1" w:val="4F81BD"/>
+      <w:sz w:val="24"/>
+      <w:szCs w:val="24"/>
+    </w:rPr>
+  </w:style>
+  <w:style w:styleId="BlockText" w:type="paragraph">
+    <w:name w:val="Block Text"/>
+    <w:basedOn w:val="BodyText"/>
+    <w:next w:val="BodyText"/>
+    <w:uiPriority w:val="9"/>
+    <w:unhideWhenUsed/>
+    <w:qFormat/>
+    <w:pPr>
+      <w:spacing w:after="100" w:before="100"/>
+      <w:ind w:firstLine="0" w:left="480" w:right="480"/>
+    </w:pPr>
+  </w:style>
+  <w:style w:styleId="FootnoteText" w:type="paragraph">
+    <w:name w:val="Footnote Text"/>
+    <w:basedOn w:val="Normal"/>
+    <w:next w:val="FootnoteText"/>
+    <w:uiPriority w:val="9"/>
+    <w:unhideWhenUsed/>
+    <w:qFormat/>
+  </w:style>
+  <w:style w:default="1" w:styleId="DefaultParagraphFont" w:type="character">
+    <w:name w:val="Default Paragraph Font"/>
+    <w:semiHidden/>
+    <w:unhideWhenUsed/>
+  </w:style>
+  <w:style w:default="1" w:styleId="Table" w:type="table">
+    <w:name w:val="Table"/>
     <w:basedOn w:val="TableNormal"/>
+    <w:semiHidden/>
+    <w:unhideWhenUsed/>
+    <w:qFormat/>
     <w:tblPr>
-      <w:tblStyleRowBandSize w:val="1"/>
-      <w:tblStyleColBandSize w:val="1"/>
-      <w:tblCellMar/>
+      <w:tblInd w:type="dxa" w:w="0"/>
+      <w:tblCellMar>
+        <w:top w:type="dxa" w:w="0"/>
+        <w:left w:type="dxa" w:w="108"/>
+        <w:bottom w:type="dxa" w:w="0"/>
+        <w:right w:type="dxa" w:w="108"/>
+      </w:tblCellMar>
     </w:tblPr>
-    <w:tblStylePr w:type="band1Horz">
-      <w:tcPr/>
+    <w:tblStylePr w:type="firstRow">
+      <w:tblPr>
+        <w:jc w:val="left"/>
+        <w:tblInd w:type="dxa" w:w="0"/>
+      </w:tblPr>
+      <w:trPr>
+        <w:jc w:val="left"/>
+      </w:trPr>
+      <w:tcPr>
+        <w:vAlign w:val="bottom"/>
+        <w:tcBorders>
+          <w:bottom w:val="single"/>
+        </w:tcBorders>
+      </w:tcPr>
     </w:tblStylePr>
-    <w:tblStylePr w:type="band1Vert">
-      <w:tcPr/>
-    </w:tblStylePr>
-    <w:tblStylePr w:type="band2Horz">
-      <w:tcPr/>
-    </w:tblStylePr>
-    <w:tblStylePr w:type="band2Vert">
-      <w:tcPr/>
-    </w:tblStylePr>
-    <w:tblStylePr w:type="firstCol">
-      <w:tcPr/>
-    </w:tblStylePr>
-    <w:tblStylePr w:type="firstRow">
-      <w:tcPr/>
-    </w:tblStylePr>
-    <w:tblStylePr w:type="lastCol">
-      <w:tcPr/>
-    </w:tblStylePr>
-    <w:tblStylePr w:type="lastRow">
-      <w:tcPr/>
-    </w:tblStylePr>
-    <w:tblStylePr w:type="neCell">
-      <w:tcPr/>
-    </w:tblStylePr>
-    <w:tblStylePr w:type="nwCell">
-      <w:tcPr/>
-    </w:tblStylePr>
-    <w:tblStylePr w:type="seCell">
-      <w:tcPr/>
-    </w:tblStylePr>
-    <w:tblStylePr w:type="swCell">
-      <w:tcPr/>
-    </w:tblStylePr>
-  </w:style>
-  <w:style w:styleId="Table2" w:type="table">
-    <w:basedOn w:val="TableNormal"/>
-    <w:tblPr>
-      <w:tblStyleRowBandSize w:val="1"/>
-      <w:tblStyleColBandSize w:val="1"/>
-      <w:tblCellMar/>
-    </w:tblPr>
-    <w:tblStylePr w:type="band1Horz">
-      <w:tcPr/>
-    </w:tblStylePr>
-    <w:tblStylePr w:type="band1Vert">
-      <w:tcPr/>
-    </w:tblStylePr>
-    <w:tblStylePr w:type="band2Horz">
-      <w:tcPr/>
-    </w:tblStylePr>
-    <w:tblStylePr w:type="band2Vert">
-      <w:tcPr/>
-    </w:tblStylePr>
-    <w:tblStylePr w:type="firstCol">
-      <w:tcPr/>
-    </w:tblStylePr>
-    <w:tblStylePr w:type="firstRow">
-      <w:tcPr/>
-    </w:tblStylePr>
-    <w:tblStylePr w:type="lastCol">
-      <w:tcPr/>
-    </w:tblStylePr>
-    <w:tblStylePr w:type="lastRow">
-      <w:tcPr/>
-    </w:tblStylePr>
-    <w:tblStylePr w:type="neCell">
-      <w:tcPr/>
-    </w:tblStylePr>
-    <w:tblStylePr w:type="nwCell">
-      <w:tcPr/>
-    </w:tblStylePr>
-    <w:tblStylePr w:type="seCell">
-      <w:tcPr/>
-    </w:tblStylePr>
-    <w:tblStylePr w:type="swCell">
-      <w:tcPr/>
-    </w:tblStylePr>
-  </w:style>
-  <w:style w:styleId="Table3" w:type="table">
-    <w:basedOn w:val="TableNormal"/>
-    <w:tblPr>
-      <w:tblStyleRowBandSize w:val="1"/>
-      <w:tblStyleColBandSize w:val="1"/>
-      <w:tblCellMar/>
-    </w:tblPr>
-    <w:tblStylePr w:type="band1Horz">
-      <w:tcPr/>
-    </w:tblStylePr>
-    <w:tblStylePr w:type="band1Vert">
-      <w:tcPr/>
-    </w:tblStylePr>
-    <w:tblStylePr w:type="band2Horz">
-      <w:tcPr/>
-    </w:tblStylePr>
-    <w:tblStylePr w:type="band2Vert">
-      <w:tcPr/>
-    </w:tblStylePr>
-    <w:tblStylePr w:type="firstCol">
-      <w:tcPr/>
-    </w:tblStylePr>
-    <w:tblStylePr w:type="firstRow">
-      <w:tcPr/>
-    </w:tblStylePr>
-    <w:tblStylePr w:type="lastCol">
-      <w:tcPr/>
-    </w:tblStylePr>
-    <w:tblStylePr w:type="lastRow">
-      <w:tcPr/>
-    </w:tblStylePr>
-    <w:tblStylePr w:type="neCell">
-      <w:tcPr/>
-    </w:tblStylePr>
-    <w:tblStylePr w:type="nwCell">
-      <w:tcPr/>
-    </w:tblStylePr>
-    <w:tblStylePr w:type="seCell">
-      <w:tcPr/>
-    </w:tblStylePr>
-    <w:tblStylePr w:type="swCell">
-      <w:tcPr/>
-    </w:tblStylePr>
-  </w:style>
-  <w:style w:styleId="Table4" w:type="table">
-    <w:basedOn w:val="TableNormal"/>
-    <w:tblPr>
-      <w:tblStyleRowBandSize w:val="1"/>
-      <w:tblStyleColBandSize w:val="1"/>
-      <w:tblCellMar/>
-    </w:tblPr>
-    <w:tblStylePr w:type="band1Horz">
-      <w:tcPr/>
-    </w:tblStylePr>
-    <w:tblStylePr w:type="band1Vert">
-      <w:tcPr/>
-    </w:tblStylePr>
-    <w:tblStylePr w:type="band2Horz">
-      <w:tcPr/>
-    </w:tblStylePr>
-    <w:tblStylePr w:type="band2Vert">
-      <w:tcPr/>
-    </w:tblStylePr>
-    <w:tblStylePr w:type="firstCol">
-      <w:tcPr/>
-    </w:tblStylePr>
-    <w:tblStylePr w:type="firstRow">
-      <w:tcPr/>
-    </w:tblStylePr>
-    <w:tblStylePr w:type="lastCol">
-      <w:tcPr/>
-    </w:tblStylePr>
-    <w:tblStylePr w:type="lastRow">
-      <w:tcPr/>
-    </w:tblStylePr>
-    <w:tblStylePr w:type="neCell">
-      <w:tcPr/>
-    </w:tblStylePr>
-    <w:tblStylePr w:type="nwCell">
-      <w:tcPr/>
-    </w:tblStylePr>
-    <w:tblStylePr w:type="seCell">
-      <w:tcPr/>
-    </w:tblStylePr>
-    <w:tblStylePr w:type="swCell">
-      <w:tcPr/>
-    </w:tblStylePr>
-  </w:style>
-  <w:style w:styleId="Table5" w:type="table">
-    <w:basedOn w:val="TableNormal"/>
-    <w:tblPr>
-      <w:tblStyleRowBandSize w:val="1"/>
-      <w:tblStyleColBandSize w:val="1"/>
-      <w:tblCellMar/>
-    </w:tblPr>
-    <w:tblStylePr w:type="band1Horz">
-      <w:tcPr/>
-    </w:tblStylePr>
-    <w:tblStylePr w:type="band1Vert">
-      <w:tcPr/>
-    </w:tblStylePr>
-    <w:tblStylePr w:type="band2Horz">
-      <w:tcPr/>
-    </w:tblStylePr>
-    <w:tblStylePr w:type="band2Vert">
-      <w:tcPr/>
-    </w:tblStylePr>
-    <w:tblStylePr w:type="firstCol">
-      <w:tcPr/>
-    </w:tblStylePr>
-    <w:tblStylePr w:type="firstRow">
-      <w:tcPr/>
-    </w:tblStylePr>
-    <w:tblStylePr w:type="lastCol">
-      <w:tcPr/>
-    </w:tblStylePr>
-    <w:tblStylePr w:type="lastRow">
-      <w:tcPr/>
-    </w:tblStylePr>
-    <w:tblStylePr w:type="neCell">
-      <w:tcPr/>
-    </w:tblStylePr>
-    <w:tblStylePr w:type="nwCell">
-      <w:tcPr/>
-    </w:tblStylePr>
-    <w:tblStylePr w:type="seCell">
-      <w:tcPr/>
-    </w:tblStylePr>
-    <w:tblStylePr w:type="swCell">
-      <w:tcPr/>
-    </w:tblStylePr>
-  </w:style>
-  <w:style w:styleId="Table6" w:type="table">
-    <w:basedOn w:val="TableNormal"/>
-    <w:tblPr>
-      <w:tblStyleRowBandSize w:val="1"/>
-      <w:tblStyleColBandSize w:val="1"/>
-      <w:tblCellMar/>
-    </w:tblPr>
-    <w:tblStylePr w:type="band1Horz">
-      <w:tcPr/>
-    </w:tblStylePr>
-    <w:tblStylePr w:type="band1Vert">
-      <w:tcPr/>
-    </w:tblStylePr>
-    <w:tblStylePr w:type="band2Horz">
-      <w:tcPr/>
-    </w:tblStylePr>
-    <w:tblStylePr w:type="band2Vert">
-      <w:tcPr/>
-    </w:tblStylePr>
-    <w:tblStylePr w:type="firstCol">
-      <w:tcPr/>
-    </w:tblStylePr>
-    <w:tblStylePr w:type="firstRow">
-      <w:tcPr/>
-    </w:tblStylePr>
-    <w:tblStylePr w:type="lastCol">
-      <w:tcPr/>
-    </w:tblStylePr>
-    <w:tblStylePr w:type="lastRow">
-      <w:tcPr/>
-    </w:tblStylePr>
-    <w:tblStylePr w:type="neCell">
-      <w:tcPr/>
-    </w:tblStylePr>
-    <w:tblStylePr w:type="nwCell">
-      <w:tcPr/>
-    </w:tblStylePr>
-    <w:tblStylePr w:type="seCell">
-      <w:tcPr/>
-    </w:tblStylePr>
-    <w:tblStylePr w:type="swCell">
-      <w:tcPr/>
-    </w:tblStylePr>
-  </w:style>
-  <w:style w:styleId="Table7" w:type="table">
-    <w:basedOn w:val="TableNormal"/>
-    <w:tblPr>
-      <w:tblStyleRowBandSize w:val="1"/>
-      <w:tblStyleColBandSize w:val="1"/>
-      <w:tblCellMar/>
-    </w:tblPr>
-    <w:tblStylePr w:type="band1Horz">
-      <w:tcPr/>
-    </w:tblStylePr>
-    <w:tblStylePr w:type="band1Vert">
-      <w:tcPr/>
-    </w:tblStylePr>
-    <w:tblStylePr w:type="band2Horz">
-      <w:tcPr/>
-    </w:tblStylePr>
-    <w:tblStylePr w:type="band2Vert">
-      <w:tcPr/>
-    </w:tblStylePr>
-    <w:tblStylePr w:type="firstCol">
-      <w:tcPr/>
-    </w:tblStylePr>
-    <w:tblStylePr w:type="firstRow">
-      <w:tcPr/>
-    </w:tblStylePr>
-    <w:tblStylePr w:type="lastCol">
-      <w:tcPr/>
-    </w:tblStylePr>
-    <w:tblStylePr w:type="lastRow">
-      <w:tcPr/>
-    </w:tblStylePr>
-    <w:tblStylePr w:type="neCell">
-      <w:tcPr/>
-    </w:tblStylePr>
-    <w:tblStylePr w:type="nwCell">
-      <w:tcPr/>
-    </w:tblStylePr>
-    <w:tblStylePr w:type="seCell">
-      <w:tcPr/>
-    </w:tblStylePr>
-    <w:tblStylePr w:type="swCell">
-      <w:tcPr/>
-    </w:tblStylePr>
-  </w:style>
-  <w:style w:styleId="Table8" w:type="table">
-    <w:basedOn w:val="TableNormal"/>
-    <w:tblPr>
-      <w:tblStyleRowBandSize w:val="1"/>
-      <w:tblStyleColBandSize w:val="1"/>
-      <w:tblCellMar/>
-    </w:tblPr>
-    <w:tblStylePr w:type="band1Horz">
-      <w:tcPr/>
-    </w:tblStylePr>
-    <w:tblStylePr w:type="band1Vert">
-      <w:tcPr/>
-    </w:tblStylePr>
-    <w:tblStylePr w:type="band2Horz">
-      <w:tcPr/>
-    </w:tblStylePr>
-    <w:tblStylePr w:type="band2Vert">
-      <w:tcPr/>
-    </w:tblStylePr>
-    <w:tblStylePr w:type="firstCol">
-      <w:tcPr/>
-    </w:tblStylePr>
-    <w:tblStylePr w:type="firstRow">
-      <w:tcPr/>
-    </w:tblStylePr>
-    <w:tblStylePr w:type="lastCol">
-      <w:tcPr/>
-    </w:tblStylePr>
-    <w:tblStylePr w:type="lastRow">
-      <w:tcPr/>
-    </w:tblStylePr>
-    <w:tblStylePr w:type="neCell">
-      <w:tcPr/>
-    </w:tblStylePr>
-    <w:tblStylePr w:type="nwCell">
-      <w:tcPr/>
-    </w:tblStylePr>
-    <w:tblStylePr w:type="seCell">
-      <w:tcPr/>
-    </w:tblStylePr>
-    <w:tblStylePr w:type="swCell">
-      <w:tcPr/>
-    </w:tblStylePr>
+  </w:style>
+  <w:style w:customStyle="1" w:styleId="DefinitionTerm" w:type="paragraph">
+    <w:name w:val="Definition Term"/>
+    <w:basedOn w:val="Normal"/>
+    <w:next w:val="Definition"/>
+    <w:pPr>
+      <w:keepNext/>
+      <w:keepLines/>
+      <w:spacing w:after="0"/>
+    </w:pPr>
+    <w:rPr>
+      <w:b/>
+    </w:rPr>
+  </w:style>
+  <w:style w:customStyle="1" w:styleId="Definition" w:type="paragraph">
+    <w:name w:val="Definition"/>
+    <w:basedOn w:val="Normal"/>
+  </w:style>
+  <w:style w:styleId="Caption" w:type="paragraph">
+    <w:name w:val="Caption"/>
+    <w:basedOn w:val="Normal"/>
+    <w:link w:val="BodyTextChar"/>
+    <w:pPr>
+      <w:spacing w:after="120" w:before="0"/>
+    </w:pPr>
+    <w:rPr>
+      <w:i/>
+    </w:rPr>
+  </w:style>
+  <w:style w:customStyle="1" w:styleId="TableCaption" w:type="paragraph">
+    <w:name w:val="Table Caption"/>
+    <w:basedOn w:val="Caption"/>
+    <w:pPr>
+      <w:keepNext/>
+    </w:pPr>
+  </w:style>
+  <w:style w:customStyle="1" w:styleId="ImageCaption" w:type="paragraph">
+    <w:name w:val="Image Caption"/>
+    <w:basedOn w:val="Caption"/>
+  </w:style>
+  <w:style w:customStyle="1" w:styleId="Figure" w:type="paragraph">
+    <w:name w:val="Figure"/>
+    <w:basedOn w:val="Normal"/>
+  </w:style>
+  <w:style w:customStyle="1" w:styleId="CaptionedFigure" w:type="paragraph">
+    <w:name w:val="Captioned Figure"/>
+    <w:basedOn w:val="Figure"/>
+    <w:pPr>
+      <w:keepNext/>
+    </w:pPr>
+  </w:style>
+  <w:style w:customStyle="1" w:styleId="BodyTextChar" w:type="character">
+    <w:name w:val="Body Text Char"/>
+    <w:basedOn w:val="DefaultParagraphFont"/>
+    <w:link w:val="BodyText"/>
+  </w:style>
+  <w:style w:customStyle="1" w:styleId="VerbatimChar" w:type="character">
+    <w:name w:val="Verbatim Char"/>
+    <w:basedOn w:val="BodyTextChar"/>
+    <w:rPr>
+      <w:rFonts w:ascii="Consolas" w:hAnsi="Consolas"/>
+      <w:sz w:val="22"/>
+    </w:rPr>
+  </w:style>
+  <w:style w:customStyle="1" w:styleId="SectionNumber" w:type="character">
+    <w:name w:val="Section Number"/>
+    <w:basedOn w:val="BodyTextChar"/>
+  </w:style>
+  <w:style w:styleId="FootnoteReference" w:type="character">
+    <w:name w:val="Footnote Reference"/>
+    <w:basedOn w:val="BodyTextChar"/>
+    <w:rPr>
+      <w:vertAlign w:val="superscript"/>
+    </w:rPr>
+  </w:style>
+  <w:style w:styleId="Hyperlink" w:type="character">
+    <w:name w:val="Hyperlink"/>
+    <w:basedOn w:val="BodyTextChar"/>
+    <w:rPr>
+      <w:color w:themeColor="accent1" w:val="4F81BD"/>
+    </w:rPr>
+  </w:style>
+  <w:style w:styleId="TOCHeading" w:type="paragraph">
+    <w:name w:val="TOC Heading"/>
+    <w:basedOn w:val="Heading1"/>
+    <w:next w:val="BodyText"/>
+    <w:uiPriority w:val="39"/>
+    <w:unhideWhenUsed/>
+    <w:qFormat/>
+    <w:pPr>
+      <w:spacing w:before="240" w:line="259" w:lineRule="auto"/>
+      <w:outlineLvl w:val="9"/>
+    </w:pPr>
+    <w:rPr>
+      <w:rFonts w:asciiTheme="majorHAnsi" w:cstheme="majorBidi" w:eastAsiaTheme="majorEastAsia" w:hAnsiTheme="majorHAnsi"/>
+      <w:b w:val="0"/>
+      <w:bCs w:val="0"/>
+      <w:color w:themeColor="accent1" w:themeShade="BF" w:val="365F91"/>
+    </w:rPr>
   </w:style>
   <w:style w:type="paragraph" w:customStyle="1" w:styleId="SourceCode">
     <w:name w:val="Source Code"/>
@@ -2823,7 +2391,6 @@
         <a:font script="Mong" typeface="Mongolian Baiti"/>
         <a:font script="Viet" typeface="Times New Roman"/>
         <a:font script="Uigh" typeface="Microsoft Uighur"/>
-        <a:font script="Geor" typeface="Sylfaen"/>
       </a:majorFont>
       <a:minorFont>
         <a:latin typeface="Cambria"/>
@@ -2858,7 +2425,6 @@
         <a:font script="Mong" typeface="Mongolian Baiti"/>
         <a:font script="Viet" typeface="Arial"/>
         <a:font script="Uigh" typeface="Microsoft Uighur"/>
-        <a:font script="Geor" typeface="Sylfaen"/>
       </a:minorFont>
     </a:fontScheme>
     <a:fmtScheme name="Office">

</xml_diff>